<commit_message>
feat: Phase 4 & 5 — Planner, Healer, and Report agents
Phase 4: AI-Powered Agents
- PlannerAgent: generates test plans from feature descriptions (generate-plan, decompose-feature, prioritize, estimate)
- HealerAgent: diagnoses failures and suggests auto-fixes (diagnose, analyze-report, heal-selector, retry-with-fix)

Phase 5: Report Agent
- ReportAgent: generates HTML/Markdown dashboards and trend analysis (generate-summary, export-html, export-markdown, trend-analysis)
- Persists run history for pass rate trend tracking

Updated agent-demo.ts to showcase all 8 agents (supervisor + 7 specialists)
13 tests, 100% pass rate, full orchestration working
</commit_message>
<xml_diff>
--- a/BROWNBAG-SESSION-GUIDE.docx
+++ b/BROWNBAG-SESSION-GUIDE.docx
@@ -26,7 +26,7 @@
           <w:color w:val="4A5568"/>
           <w:sz w:val="36"/>
         </w:rPr>
-        <w:t>Enterprise Test Automation Framework</w:t>
+        <w:t>Agentic Test Automation Framework</w:t>
       </w:r>
     </w:p>
     <w:p/>
@@ -37,9 +37,9 @@
       <w:r>
         <w:rPr>
           <w:i/>
-          <w:sz w:val="28"/>
+          <w:sz w:val="26"/>
         </w:rPr>
-        <w:t>One Framework. All Platforms. AI-Powered.</w:t>
+        <w:t>Multi-Agent Orchestration — One Framework, All Platforms, AI-Powered</w:t>
       </w:r>
     </w:p>
     <w:p/>
@@ -67,70 +67,20 @@
         </w:rPr>
         <w:t>By Sampath Racherla</w:t>
       </w:r>
-    </w:p>
-    <w:p>
       <w:r>
-        <w:br w:type="page"/>
+        <w:rPr>
+          <w:b/>
+          <w:sz w:val="28"/>
+        </w:rPr>
+        <w:br/>
       </w:r>
-    </w:p>
-    <w:p>
-      <w:pPr>
-        <w:pStyle w:val="Heading1"/>
-      </w:pPr>
       <w:r>
-        <w:lastRenderedPageBreak/>
-        <w:t>What is Atomiq AI?</w:t>
-      </w:r>
-    </w:p>
-    <w:p>
-      <w:r>
-        <w:t>Atomiq AI is a robot that tests your applications the way a human would — clicking buttons, typing text, checking if things look right — but it does it in seconds, not hours.</w:t>
-      </w:r>
-    </w:p>
-    <w:p>
-      <w:pPr>
-        <w:pStyle w:val="Heading2"/>
-      </w:pPr>
-      <w:r>
-        <w:t>Why Does It Exist?</w:t>
-      </w:r>
-    </w:p>
-    <w:p>
-      <w:pPr>
-        <w:pStyle w:val="ListBullet"/>
-      </w:pPr>
-      <w:r>
-        <w:t>The Problem Today:</w:t>
-      </w:r>
-    </w:p>
-    <w:p>
-      <w:pPr>
-        <w:pStyle w:val="ListBullet2"/>
-      </w:pPr>
-      <w:r>
-        <w:t>Companies use 5+ different tools to test different things (one for websites, one for APIs, one for SAP, one for mobile)</w:t>
-      </w:r>
-    </w:p>
-    <w:p>
-      <w:pPr>
-        <w:pStyle w:val="ListBullet2"/>
-      </w:pPr>
-      <w:r>
-        <w:t>When developers change a button's name, all tests break → someone spends hours fixing them</w:t>
-      </w:r>
-    </w:p>
-    <w:p>
-      <w:pPr>
-        <w:pStyle w:val="ListBullet2"/>
-      </w:pPr>
-      <w:r>
-        <w:t>Writing tests is slow and manual</w:t>
-      </w:r>
-    </w:p>
-    <w:p/>
-    <w:p>
-      <w:r>
-        <w:t>Atomiq AI solves all three — one tool for everything, tests that fix themselves, and AI that helps write tests.</w:t>
+        <w:rPr>
+          <w:color w:val="718096"/>
+          <w:sz w:val="20"/>
+        </w:rPr>
+        <w:br/>
+        <w:t>github.com/sampathracherla/atomiq-ai</w:t>
       </w:r>
     </w:p>
     <w:p>
@@ -144,28 +94,26 @@
       </w:pPr>
       <w:r>
         <w:lastRenderedPageBreak/>
-        <w:t>The 5 Key Features</w:t>
-      </w:r>
-    </w:p>
-    <w:p>
-      <w:pPr>
-        <w:pStyle w:val="Heading2"/>
-      </w:pPr>
-      <w:r>
-        <w:t>1. Page Object Model (POM)</w:t>
+        <w:t>What is Atomiq AI?</w:t>
       </w:r>
     </w:p>
     <w:p>
       <w:r>
-        <w:t>Analogy: Instead of writing directions to the coffee machine 50 times in 50 emails, you write it once on a sign. If the coffee machine moves, you update ONE sign.</w:t>
+        <w:t>Atomiq AI is an enterprise test automation framework that uses AI agents to autonomously run, manage, and report on tests across all platforms — Web, API, Mobile, and SAP.</w:t>
+      </w:r>
+    </w:p>
+    <w:p/>
+    <w:p>
+      <w:r>
+        <w:t>Think of it like a team of specialist robots: one knows how to test websites, one handles API endpoints, one tests on phones, and one deals with SAP. A supervisor robot coordinates them all and delivers a unified report.</w:t>
       </w:r>
     </w:p>
     <w:p>
       <w:pPr>
-        <w:pStyle w:val="ListBullet"/>
+        <w:pStyle w:val="Heading2"/>
       </w:pPr>
       <w:r>
-        <w:t>Each page/screen in your app gets ONE file describing its elements</w:t>
+        <w:t>The Problem We Solve</w:t>
       </w:r>
     </w:p>
     <w:p>
@@ -173,7 +121,7 @@
         <w:pStyle w:val="ListBullet"/>
       </w:pPr>
       <w:r>
-        <w:t>100 tests can share that ONE file</w:t>
+        <w:t>3-5 separate tools to license, learn, and maintain</w:t>
       </w:r>
     </w:p>
     <w:p>
@@ -181,20 +129,23 @@
         <w:pStyle w:val="ListBullet"/>
       </w:pPr>
       <w:r>
-        <w:t>If something changes → update 1 place, not 100 tests</w:t>
+        <w:t>Selectors break every sprint — hours spent on manual fixes</w:t>
       </w:r>
     </w:p>
     <w:p>
       <w:pPr>
-        <w:pStyle w:val="Heading2"/>
+        <w:pStyle w:val="ListBullet"/>
       </w:pPr>
       <w:r>
-        <w:t>2. Self-Healing Selectors</w:t>
+        <w:t>No AI integration — manual test creation and failure diagnosis</w:t>
       </w:r>
     </w:p>
     <w:p>
+      <w:pPr>
+        <w:pStyle w:val="ListBullet"/>
+      </w:pPr>
       <w:r>
-        <w:t>Analogy: You tell someone "click the blue Save button." They arrive and it's now green and says "Submit." A normal robot gives up. Atomiq AI thinks: "It's still the only button at the bottom of the form" and clicks it anyway.</w:t>
+        <w:t>Team silos — different skills needed per tool</w:t>
       </w:r>
     </w:p>
     <w:p>
@@ -202,242 +153,7 @@
         <w:pStyle w:val="ListBullet"/>
       </w:pPr>
       <w:r>
-        <w:t>4 backup strategies to find elements even when they change</w:t>
-      </w:r>
-    </w:p>
-    <w:p>
-      <w:pPr>
-        <w:pStyle w:val="ListBullet"/>
-      </w:pPr>
-      <w:r>
-        <w:t>Tests keep running without human intervention</w:t>
-      </w:r>
-    </w:p>
-    <w:p>
-      <w:pPr>
-        <w:pStyle w:val="ListBullet"/>
-      </w:pPr>
-      <w:r>
-        <w:t>Less maintenance = less cost</w:t>
-      </w:r>
-    </w:p>
-    <w:p>
-      <w:pPr>
-        <w:pStyle w:val="Heading2"/>
-      </w:pPr>
-      <w:r>
-        <w:t>3. Pluggable AI Providers</w:t>
-      </w:r>
-    </w:p>
-    <w:p>
-      <w:r>
-        <w:t>Analogy: Like having 4 different translators on speed dial (OpenAI, Azure, Google, Claude). Need a different one? Swap with one line — no rebuilding anything.</w:t>
-      </w:r>
-    </w:p>
-    <w:p>
-      <w:pPr>
-        <w:pStyle w:val="ListBullet"/>
-      </w:pPr>
-      <w:r>
-        <w:t>AI can write tests from English descriptions</w:t>
-      </w:r>
-    </w:p>
-    <w:p>
-      <w:pPr>
-        <w:pStyle w:val="ListBullet"/>
-      </w:pPr>
-      <w:r>
-        <w:t>AI can diagnose why a test failed</w:t>
-      </w:r>
-    </w:p>
-    <w:p>
-      <w:pPr>
-        <w:pStyle w:val="ListBullet"/>
-      </w:pPr>
-      <w:r>
-        <w:t>No vendor lock-in — switch providers freely</w:t>
-      </w:r>
-    </w:p>
-    <w:p>
-      <w:pPr>
-        <w:pStyle w:val="Heading2"/>
-      </w:pPr>
-      <w:r>
-        <w:t>4. Multi-Platform (Web, API, Mobile, SAP)</w:t>
-      </w:r>
-    </w:p>
-    <w:p>
-      <w:r>
-        <w:t>Analogy: Instead of buying a separate car for highways, city, off-road, and snow — you have ONE vehicle that handles all terrain.</w:t>
-      </w:r>
-    </w:p>
-    <w:tbl>
-      <w:tblPr>
-        <w:tblStyle w:val="LightGrid-Accent1"/>
-        <w:tblW w:w="0" w:type="auto"/>
-        <w:tblLook w:val="04A0" w:firstRow="1" w:lastRow="0" w:firstColumn="1" w:lastColumn="0" w:noHBand="0" w:noVBand="1"/>
-      </w:tblPr>
-      <w:tblGrid>
-        <w:gridCol w:w="4320"/>
-        <w:gridCol w:w="4320"/>
-      </w:tblGrid>
-      <w:tr>
-        <w:trPr>
-          <w:cnfStyle w:val="100000000000" w:firstRow="1" w:lastRow="0" w:firstColumn="0" w:lastColumn="0" w:oddVBand="0" w:evenVBand="0" w:oddHBand="0" w:evenHBand="0" w:firstRowFirstColumn="0" w:firstRowLastColumn="0" w:lastRowFirstColumn="0" w:lastRowLastColumn="0"/>
-        </w:trPr>
-        <w:tc>
-          <w:tcPr>
-            <w:cnfStyle w:val="001000000000" w:firstRow="0" w:lastRow="0" w:firstColumn="1" w:lastColumn="0" w:oddVBand="0" w:evenVBand="0" w:oddHBand="0" w:evenHBand="0" w:firstRowFirstColumn="0" w:firstRowLastColumn="0" w:lastRowFirstColumn="0" w:lastRowLastColumn="0"/>
-            <w:tcW w:w="4320" w:type="dxa"/>
-          </w:tcPr>
-          <w:p>
-            <w:r>
-              <w:t>Platform</w:t>
-            </w:r>
-          </w:p>
-        </w:tc>
-        <w:tc>
-          <w:tcPr>
-            <w:tcW w:w="4320" w:type="dxa"/>
-          </w:tcPr>
-          <w:p>
-            <w:pPr>
-              <w:cnfStyle w:val="100000000000" w:firstRow="1" w:lastRow="0" w:firstColumn="0" w:lastColumn="0" w:oddVBand="0" w:evenVBand="0" w:oddHBand="0" w:evenHBand="0" w:firstRowFirstColumn="0" w:firstRowLastColumn="0" w:lastRowFirstColumn="0" w:lastRowLastColumn="0"/>
-            </w:pPr>
-            <w:r>
-              <w:t>What It Tests</w:t>
-            </w:r>
-          </w:p>
-        </w:tc>
-      </w:tr>
-      <w:tr>
-        <w:trPr>
-          <w:cnfStyle w:val="000000100000" w:firstRow="0" w:lastRow="0" w:firstColumn="0" w:lastColumn="0" w:oddVBand="0" w:evenVBand="0" w:oddHBand="1" w:evenHBand="0" w:firstRowFirstColumn="0" w:firstRowLastColumn="0" w:lastRowFirstColumn="0" w:lastRowLastColumn="0"/>
-        </w:trPr>
-        <w:tc>
-          <w:tcPr>
-            <w:cnfStyle w:val="001000000000" w:firstRow="0" w:lastRow="0" w:firstColumn="1" w:lastColumn="0" w:oddVBand="0" w:evenVBand="0" w:oddHBand="0" w:evenHBand="0" w:firstRowFirstColumn="0" w:firstRowLastColumn="0" w:lastRowFirstColumn="0" w:lastRowLastColumn="0"/>
-            <w:tcW w:w="4320" w:type="dxa"/>
-          </w:tcPr>
-          <w:p>
-            <w:r>
-              <w:t>Web</w:t>
-            </w:r>
-          </w:p>
-        </w:tc>
-        <w:tc>
-          <w:tcPr>
-            <w:tcW w:w="4320" w:type="dxa"/>
-          </w:tcPr>
-          <w:p>
-            <w:pPr>
-              <w:cnfStyle w:val="000000100000" w:firstRow="0" w:lastRow="0" w:firstColumn="0" w:lastColumn="0" w:oddVBand="0" w:evenVBand="0" w:oddHBand="1" w:evenHBand="0" w:firstRowFirstColumn="0" w:firstRowLastColumn="0" w:lastRowFirstColumn="0" w:lastRowLastColumn="0"/>
-            </w:pPr>
-            <w:r>
-              <w:t>Clicking, typing, navigating websites</w:t>
-            </w:r>
-          </w:p>
-        </w:tc>
-      </w:tr>
-      <w:tr>
-        <w:trPr>
-          <w:cnfStyle w:val="000000010000" w:firstRow="0" w:lastRow="0" w:firstColumn="0" w:lastColumn="0" w:oddVBand="0" w:evenVBand="0" w:oddHBand="0" w:evenHBand="1" w:firstRowFirstColumn="0" w:firstRowLastColumn="0" w:lastRowFirstColumn="0" w:lastRowLastColumn="0"/>
-        </w:trPr>
-        <w:tc>
-          <w:tcPr>
-            <w:cnfStyle w:val="001000000000" w:firstRow="0" w:lastRow="0" w:firstColumn="1" w:lastColumn="0" w:oddVBand="0" w:evenVBand="0" w:oddHBand="0" w:evenHBand="0" w:firstRowFirstColumn="0" w:firstRowLastColumn="0" w:lastRowFirstColumn="0" w:lastRowLastColumn="0"/>
-            <w:tcW w:w="4320" w:type="dxa"/>
-          </w:tcPr>
-          <w:p>
-            <w:r>
-              <w:t>API</w:t>
-            </w:r>
-          </w:p>
-        </w:tc>
-        <w:tc>
-          <w:tcPr>
-            <w:tcW w:w="4320" w:type="dxa"/>
-          </w:tcPr>
-          <w:p>
-            <w:pPr>
-              <w:cnfStyle w:val="000000010000" w:firstRow="0" w:lastRow="0" w:firstColumn="0" w:lastColumn="0" w:oddVBand="0" w:evenVBand="0" w:oddHBand="0" w:evenHBand="1" w:firstRowFirstColumn="0" w:firstRowLastColumn="0" w:lastRowFirstColumn="0" w:lastRowLastColumn="0"/>
-            </w:pPr>
-            <w:r>
-              <w:t>Backend services (no browser needed)</w:t>
-            </w:r>
-          </w:p>
-        </w:tc>
-      </w:tr>
-      <w:tr>
-        <w:trPr>
-          <w:cnfStyle w:val="000000100000" w:firstRow="0" w:lastRow="0" w:firstColumn="0" w:lastColumn="0" w:oddVBand="0" w:evenVBand="0" w:oddHBand="1" w:evenHBand="0" w:firstRowFirstColumn="0" w:firstRowLastColumn="0" w:lastRowFirstColumn="0" w:lastRowLastColumn="0"/>
-        </w:trPr>
-        <w:tc>
-          <w:tcPr>
-            <w:cnfStyle w:val="001000000000" w:firstRow="0" w:lastRow="0" w:firstColumn="1" w:lastColumn="0" w:oddVBand="0" w:evenVBand="0" w:oddHBand="0" w:evenHBand="0" w:firstRowFirstColumn="0" w:firstRowLastColumn="0" w:lastRowFirstColumn="0" w:lastRowLastColumn="0"/>
-            <w:tcW w:w="4320" w:type="dxa"/>
-          </w:tcPr>
-          <w:p>
-            <w:r>
-              <w:t>Mobile</w:t>
-            </w:r>
-          </w:p>
-        </w:tc>
-        <w:tc>
-          <w:tcPr>
-            <w:tcW w:w="4320" w:type="dxa"/>
-          </w:tcPr>
-          <w:p>
-            <w:pPr>
-              <w:cnfStyle w:val="000000100000" w:firstRow="0" w:lastRow="0" w:firstColumn="0" w:lastColumn="0" w:oddVBand="0" w:evenVBand="0" w:oddHBand="1" w:evenHBand="0" w:firstRowFirstColumn="0" w:firstRowLastColumn="0" w:lastRowFirstColumn="0" w:lastRowLastColumn="0"/>
-            </w:pPr>
-            <w:r>
-              <w:t>How sites look on phones/tablets</w:t>
-            </w:r>
-          </w:p>
-        </w:tc>
-      </w:tr>
-      <w:tr>
-        <w:trPr>
-          <w:cnfStyle w:val="000000010000" w:firstRow="0" w:lastRow="0" w:firstColumn="0" w:lastColumn="0" w:oddVBand="0" w:evenVBand="0" w:oddHBand="0" w:evenHBand="1" w:firstRowFirstColumn="0" w:firstRowLastColumn="0" w:lastRowFirstColumn="0" w:lastRowLastColumn="0"/>
-        </w:trPr>
-        <w:tc>
-          <w:tcPr>
-            <w:cnfStyle w:val="001000000000" w:firstRow="0" w:lastRow="0" w:firstColumn="1" w:lastColumn="0" w:oddVBand="0" w:evenVBand="0" w:oddHBand="0" w:evenHBand="0" w:firstRowFirstColumn="0" w:firstRowLastColumn="0" w:lastRowFirstColumn="0" w:lastRowLastColumn="0"/>
-            <w:tcW w:w="4320" w:type="dxa"/>
-          </w:tcPr>
-          <w:p>
-            <w:r>
-              <w:t>SAP</w:t>
-            </w:r>
-          </w:p>
-        </w:tc>
-        <w:tc>
-          <w:tcPr>
-            <w:tcW w:w="4320" w:type="dxa"/>
-          </w:tcPr>
-          <w:p>
-            <w:pPr>
-              <w:cnfStyle w:val="000000010000" w:firstRow="0" w:lastRow="0" w:firstColumn="0" w:lastColumn="0" w:oddVBand="0" w:evenVBand="0" w:oddHBand="0" w:evenHBand="1" w:firstRowFirstColumn="0" w:firstRowLastColumn="0" w:lastRowFirstColumn="0" w:lastRowLastColumn="0"/>
-            </w:pPr>
-            <w:r>
-              <w:t>Enterprise ERP systems (Fiori)</w:t>
-            </w:r>
-          </w:p>
-        </w:tc>
-      </w:tr>
-    </w:tbl>
-    <w:p>
-      <w:pPr>
-        <w:pStyle w:val="Heading2"/>
-      </w:pPr>
-      <w:r>
-        <w:t>5. Visual Regression</w:t>
-      </w:r>
-    </w:p>
-    <w:p>
-      <w:r>
-        <w:t>Analogy: Take a photo of your website today. Tomorrow after a code change, take another photo. Atomiq AI overlays them pixel-by-pixel and highlights any differences — like a "spot the difference" game but automated.</w:t>
+        <w:t>SAP teams use completely different tooling than web teams</w:t>
       </w:r>
     </w:p>
     <w:p>
@@ -451,7 +167,20 @@
       </w:pPr>
       <w:r>
         <w:lastRenderedPageBreak/>
-        <w:t>Live Demo Plan (7 minutes)</w:t>
+        <w:t>Agentic Architecture</w:t>
+      </w:r>
+    </w:p>
+    <w:p>
+      <w:r>
+        <w:t>Atomiq AI uses a Supervisor pattern where a central orchestrator agent delegates work to specialist agents. Each agent is autonomous, communicates via a MessageBus, and reports results back to the supervisor.</w:t>
+      </w:r>
+    </w:p>
+    <w:p>
+      <w:pPr>
+        <w:pStyle w:val="Heading2"/>
+      </w:pPr>
+      <w:r>
+        <w:t>The Agents</w:t>
       </w:r>
     </w:p>
     <w:tbl>
@@ -476,7 +205,7 @@
           </w:tcPr>
           <w:p>
             <w:r>
-              <w:t>Demo</w:t>
+              <w:t>Agent</w:t>
             </w:r>
           </w:p>
         </w:tc>
@@ -489,7 +218,7 @@
               <w:cnfStyle w:val="100000000000" w:firstRow="1" w:lastRow="0" w:firstColumn="0" w:lastColumn="0" w:oddVBand="0" w:evenVBand="0" w:oddHBand="0" w:evenHBand="0" w:firstRowFirstColumn="0" w:firstRowLastColumn="0" w:lastRowFirstColumn="0" w:lastRowLastColumn="0"/>
             </w:pPr>
             <w:r>
-              <w:t>What Audience Sees</w:t>
+              <w:t>Role</w:t>
             </w:r>
           </w:p>
         </w:tc>
@@ -502,7 +231,7 @@
               <w:cnfStyle w:val="100000000000" w:firstRow="1" w:lastRow="0" w:firstColumn="0" w:lastColumn="0" w:oddVBand="0" w:evenVBand="0" w:oddHBand="0" w:evenHBand="0" w:firstRowFirstColumn="0" w:firstRowLastColumn="0" w:lastRowFirstColumn="0" w:lastRowLastColumn="0"/>
             </w:pPr>
             <w:r>
-              <w:t>Time</w:t>
+              <w:t>Capabilities</w:t>
             </w:r>
           </w:p>
         </w:tc>
@@ -518,7 +247,7 @@
           </w:tcPr>
           <w:p>
             <w:r>
-              <w:t>SauceDemo</w:t>
+              <w:t>Supervisor</w:t>
             </w:r>
           </w:p>
         </w:tc>
@@ -531,7 +260,7 @@
               <w:cnfStyle w:val="000000100000" w:firstRow="0" w:lastRow="0" w:firstColumn="0" w:lastColumn="0" w:oddVBand="0" w:evenVBand="0" w:oddHBand="1" w:evenHBand="0" w:firstRowFirstColumn="0" w:firstRowLastColumn="0" w:lastRowFirstColumn="0" w:lastRowLastColumn="0"/>
             </w:pPr>
             <w:r>
-              <w:t>Login → browse → add to cart → checkout (full shopping flow in 8 sec)</w:t>
+              <w:t>Orchestrator</w:t>
             </w:r>
           </w:p>
         </w:tc>
@@ -544,7 +273,7 @@
               <w:cnfStyle w:val="000000100000" w:firstRow="0" w:lastRow="0" w:firstColumn="0" w:lastColumn="0" w:oddVBand="0" w:evenVBand="0" w:oddHBand="1" w:evenHBand="0" w:firstRowFirstColumn="0" w:firstRowLastColumn="0" w:lastRowFirstColumn="0" w:lastRowLastColumn="0"/>
             </w:pPr>
             <w:r>
-              <w:t>2 min</w:t>
+              <w:t>orchestrate, run-regression, system-status</w:t>
             </w:r>
           </w:p>
         </w:tc>
@@ -560,7 +289,7 @@
           </w:tcPr>
           <w:p>
             <w:r>
-              <w:t>Google</w:t>
+              <w:t>Web Agent</w:t>
             </w:r>
           </w:p>
         </w:tc>
@@ -573,7 +302,7 @@
               <w:cnfStyle w:val="000000010000" w:firstRow="0" w:lastRow="0" w:firstColumn="0" w:lastColumn="0" w:oddVBand="0" w:evenVBand="0" w:oddHBand="0" w:evenHBand="1" w:firstRowFirstColumn="0" w:firstRowLastColumn="0" w:lastRowFirstColumn="0" w:lastRowLastColumn="0"/>
             </w:pPr>
             <w:r>
-              <w:t>Search box, autocomplete, visual snapshot</w:t>
+              <w:t>Browser testing</w:t>
             </w:r>
           </w:p>
         </w:tc>
@@ -586,7 +315,7 @@
               <w:cnfStyle w:val="000000010000" w:firstRow="0" w:lastRow="0" w:firstColumn="0" w:lastColumn="0" w:oddVBand="0" w:evenVBand="0" w:oddHBand="0" w:evenHBand="1" w:firstRowFirstColumn="0" w:firstRowLastColumn="0" w:lastRowFirstColumn="0" w:lastRowLastColumn="0"/>
             </w:pPr>
             <w:r>
-              <w:t>2 min</w:t>
+              <w:t>run-all, run-spec, run-grep, list-specs</w:t>
             </w:r>
           </w:p>
         </w:tc>
@@ -602,7 +331,7 @@
           </w:tcPr>
           <w:p>
             <w:r>
-              <w:t>API</w:t>
+              <w:t>API Agent</w:t>
             </w:r>
           </w:p>
         </w:tc>
@@ -615,7 +344,7 @@
               <w:cnfStyle w:val="000000100000" w:firstRow="0" w:lastRow="0" w:firstColumn="0" w:lastColumn="0" w:oddVBand="0" w:evenVBand="0" w:oddHBand="1" w:evenHBand="0" w:firstRowFirstColumn="0" w:firstRowLastColumn="0" w:lastRowFirstColumn="0" w:lastRowLastColumn="0"/>
             </w:pPr>
             <w:r>
-              <w:t>CRUD operations, response time validation</w:t>
+              <w:t>REST/GraphQL</w:t>
             </w:r>
           </w:p>
         </w:tc>
@@ -628,7 +357,7 @@
               <w:cnfStyle w:val="000000100000" w:firstRow="0" w:lastRow="0" w:firstColumn="0" w:lastColumn="0" w:oddVBand="0" w:evenVBand="0" w:oddHBand="1" w:evenHBand="0" w:firstRowFirstColumn="0" w:firstRowLastColumn="0" w:lastRowFirstColumn="0" w:lastRowLastColumn="0"/>
             </w:pPr>
             <w:r>
-              <w:t>1 min</w:t>
+              <w:t>run-all, run-spec, run-grep</w:t>
             </w:r>
           </w:p>
         </w:tc>
@@ -644,7 +373,7 @@
           </w:tcPr>
           <w:p>
             <w:r>
-              <w:t>Mobile</w:t>
+              <w:t>Mobile Agent</w:t>
             </w:r>
           </w:p>
         </w:tc>
@@ -657,7 +386,7 @@
               <w:cnfStyle w:val="000000010000" w:firstRow="0" w:lastRow="0" w:firstColumn="0" w:lastColumn="0" w:oddVBand="0" w:evenVBand="0" w:oddHBand="0" w:evenHBand="1" w:firstRowFirstColumn="0" w:firstRowLastColumn="0" w:lastRowFirstColumn="0" w:lastRowLastColumn="0"/>
             </w:pPr>
             <w:r>
-              <w:t>Same site on iPhone, iPad, Pixel</w:t>
+              <w:t>Device testing</w:t>
             </w:r>
           </w:p>
         </w:tc>
@@ -670,7 +399,7 @@
               <w:cnfStyle w:val="000000010000" w:firstRow="0" w:lastRow="0" w:firstColumn="0" w:lastColumn="0" w:oddVBand="0" w:evenVBand="0" w:oddHBand="0" w:evenHBand="1" w:firstRowFirstColumn="0" w:firstRowLastColumn="0" w:lastRowFirstColumn="0" w:lastRowLastColumn="0"/>
             </w:pPr>
             <w:r>
-              <w:t>1 min</w:t>
+              <w:t>run-all, run-spec, run-device</w:t>
             </w:r>
           </w:p>
         </w:tc>
@@ -686,7 +415,7 @@
           </w:tcPr>
           <w:p>
             <w:r>
-              <w:t>HTML Report</w:t>
+              <w:t>SAP Agent</w:t>
             </w:r>
           </w:p>
         </w:tc>
@@ -699,7 +428,7 @@
               <w:cnfStyle w:val="000000100000" w:firstRow="0" w:lastRow="0" w:firstColumn="0" w:lastColumn="0" w:oddVBand="0" w:evenVBand="0" w:oddHBand="1" w:evenHBand="0" w:firstRowFirstColumn="0" w:firstRowLastColumn="0" w:lastRowFirstColumn="0" w:lastRowLastColumn="0"/>
             </w:pPr>
             <w:r>
-              <w:t>Beautiful dashboard with pass/fail metrics</w:t>
+              <w:t>Fiori/UI5</w:t>
             </w:r>
           </w:p>
         </w:tc>
@@ -712,27 +441,23 @@
               <w:cnfStyle w:val="000000100000" w:firstRow="0" w:lastRow="0" w:firstColumn="0" w:lastColumn="0" w:oddVBand="0" w:evenVBand="0" w:oddHBand="1" w:evenHBand="0" w:firstRowFirstColumn="0" w:firstRowLastColumn="0" w:lastRowFirstColumn="0" w:lastRowLastColumn="0"/>
             </w:pPr>
             <w:r>
-              <w:t>1 min</w:t>
+              <w:t>run-all, run-spec, run-transaction, check-connection</w:t>
             </w:r>
           </w:p>
         </w:tc>
       </w:tr>
     </w:tbl>
-    <w:p/>
     <w:p>
       <w:pPr>
         <w:pStyle w:val="Heading2"/>
       </w:pPr>
       <w:r>
-        <w:t>Demo Commands</w:t>
+        <w:t>How They Communicate</w:t>
       </w:r>
     </w:p>
     <w:p>
-      <w:pPr>
-        <w:pStyle w:val="ListBullet"/>
-      </w:pPr>
       <w:r>
-        <w:t>npx playwright test examples/saucedemo-test.spec.ts</w:t>
+        <w:t>All agents communicate through a MessageBus using two patterns:</w:t>
       </w:r>
     </w:p>
     <w:p>
@@ -740,7 +465,616 @@
         <w:pStyle w:val="ListBullet"/>
       </w:pPr>
       <w:r>
-        <w:t>npx playwright test examples/google-search.spec.ts</w:t>
+        <w:t>Pub/Sub — agents subscribe to their role and receive messages directed at them</w:t>
+      </w:r>
+    </w:p>
+    <w:p>
+      <w:pPr>
+        <w:pStyle w:val="ListBullet"/>
+      </w:pPr>
+      <w:r>
+        <w:t>Request/Reply — supervisor sends a task and awaits the result with a correlation ID</w:t>
+      </w:r>
+    </w:p>
+    <w:p>
+      <w:pPr>
+        <w:pStyle w:val="ListBullet"/>
+      </w:pPr>
+      <w:r>
+        <w:t>Broadcast — system-wide events visible to all agents</w:t>
+      </w:r>
+    </w:p>
+    <w:p/>
+    <w:p>
+      <w:r>
+        <w:t>Flow: Supervisor → MessageBus → WebAgent → executes tests → MessageBus → Supervisor receives result</w:t>
+      </w:r>
+    </w:p>
+    <w:p>
+      <w:r>
+        <w:br w:type="page"/>
+      </w:r>
+    </w:p>
+    <w:p>
+      <w:pPr>
+        <w:pStyle w:val="Heading1"/>
+      </w:pPr>
+      <w:r>
+        <w:lastRenderedPageBreak/>
+        <w:t>Full Architecture Stack</w:t>
+      </w:r>
+    </w:p>
+    <w:p>
+      <w:pPr>
+        <w:rPr>
+          <w:rFonts w:ascii="Consolas" w:hAnsi="Consolas"/>
+          <w:sz w:val="18"/>
+        </w:rPr>
+      </w:pPr>
+      <w:r>
+        <w:rPr>
+          <w:rFonts w:ascii="Consolas" w:hAnsi="Consolas"/>
+          <w:sz w:val="18"/>
+        </w:rPr>
+        <w:t>┌──────────────────────────────────────────────────────────┐</w:t>
+      </w:r>
+      <w:r>
+        <w:rPr>
+          <w:rFonts w:ascii="Consolas" w:hAnsi="Consolas"/>
+          <w:sz w:val="18"/>
+        </w:rPr>
+        <w:br/>
+        <w:t>│  Agentic Orchestration Layer                             │</w:t>
+      </w:r>
+      <w:r>
+        <w:rPr>
+          <w:rFonts w:ascii="Consolas" w:hAnsi="Consolas"/>
+          <w:sz w:val="18"/>
+        </w:rPr>
+        <w:br/>
+        <w:t>│  Supervisor → Web | API | Mobile | SAP Agents            │</w:t>
+      </w:r>
+      <w:r>
+        <w:rPr>
+          <w:rFonts w:ascii="Consolas" w:hAnsi="Consolas"/>
+          <w:sz w:val="18"/>
+        </w:rPr>
+        <w:br/>
+        <w:t xml:space="preserve">│  </w:t>
+      </w:r>
+      <w:proofErr w:type="spellStart"/>
+      <w:r>
+        <w:rPr>
+          <w:rFonts w:ascii="Consolas" w:hAnsi="Consolas"/>
+          <w:sz w:val="18"/>
+        </w:rPr>
+        <w:t>MessageBus</w:t>
+      </w:r>
+      <w:proofErr w:type="spellEnd"/>
+      <w:r>
+        <w:rPr>
+          <w:rFonts w:ascii="Consolas" w:hAnsi="Consolas"/>
+          <w:sz w:val="18"/>
+        </w:rPr>
+        <w:t xml:space="preserve"> (pub/sub + request/reply) + </w:t>
+      </w:r>
+      <w:proofErr w:type="spellStart"/>
+      <w:r>
+        <w:rPr>
+          <w:rFonts w:ascii="Consolas" w:hAnsi="Consolas"/>
+          <w:sz w:val="18"/>
+        </w:rPr>
+        <w:t>AgentRegistry</w:t>
+      </w:r>
+      <w:proofErr w:type="spellEnd"/>
+      <w:r>
+        <w:rPr>
+          <w:rFonts w:ascii="Consolas" w:hAnsi="Consolas"/>
+          <w:sz w:val="18"/>
+        </w:rPr>
+        <w:t xml:space="preserve">    │</w:t>
+      </w:r>
+      <w:r>
+        <w:rPr>
+          <w:rFonts w:ascii="Consolas" w:hAnsi="Consolas"/>
+          <w:sz w:val="18"/>
+        </w:rPr>
+        <w:br/>
+        <w:t>├──────────────────────────────────────────────────────────┤</w:t>
+      </w:r>
+      <w:r>
+        <w:rPr>
+          <w:rFonts w:ascii="Consolas" w:hAnsi="Consolas"/>
+          <w:sz w:val="18"/>
+        </w:rPr>
+        <w:br/>
+        <w:t>│  Self-Healing Engine | Visual Regression | Data Generator │</w:t>
+      </w:r>
+      <w:r>
+        <w:rPr>
+          <w:rFonts w:ascii="Consolas" w:hAnsi="Consolas"/>
+          <w:sz w:val="18"/>
+        </w:rPr>
+        <w:br/>
+        <w:t>├──────────────────────────────────────────────────────────┤</w:t>
+      </w:r>
+      <w:r>
+        <w:rPr>
+          <w:rFonts w:ascii="Consolas" w:hAnsi="Consolas"/>
+          <w:sz w:val="18"/>
+        </w:rPr>
+        <w:br/>
+        <w:t>│  AI Engine (OpenAI / Azure / Gemini / Claude / Custom)   │</w:t>
+      </w:r>
+      <w:r>
+        <w:rPr>
+          <w:rFonts w:ascii="Consolas" w:hAnsi="Consolas"/>
+          <w:sz w:val="18"/>
+        </w:rPr>
+        <w:br/>
+        <w:t>├──────────────────────────────────────────────────────────┤</w:t>
+      </w:r>
+      <w:r>
+        <w:rPr>
+          <w:rFonts w:ascii="Consolas" w:hAnsi="Consolas"/>
+          <w:sz w:val="18"/>
+        </w:rPr>
+        <w:br/>
+        <w:t>│  Playwright Foundation (Web, API, Mobile, SAP adapters)  │</w:t>
+      </w:r>
+      <w:r>
+        <w:rPr>
+          <w:rFonts w:ascii="Consolas" w:hAnsi="Consolas"/>
+          <w:sz w:val="18"/>
+        </w:rPr>
+        <w:br/>
+        <w:t>└──────────────────────────────────────────────────────────┘</w:t>
+      </w:r>
+    </w:p>
+    <w:p>
+      <w:pPr>
+        <w:rPr>
+          <w:rFonts w:ascii="Consolas" w:hAnsi="Consolas"/>
+          <w:sz w:val="18"/>
+        </w:rPr>
+      </w:pPr>
+    </w:p>
+    <w:p>
+      <w:pPr>
+        <w:rPr>
+          <w:rFonts w:ascii="Consolas" w:hAnsi="Consolas"/>
+          <w:sz w:val="18"/>
+        </w:rPr>
+      </w:pPr>
+      <w:r>
+        <w:rPr>
+          <w:rFonts w:ascii="Consolas" w:hAnsi="Consolas"/>
+          <w:sz w:val="18"/>
+        </w:rPr>
+        <w:drawing>
+          <wp:inline distT="0" distB="0" distL="0" distR="0" wp14:anchorId="54EFBE0B" wp14:editId="32B4649B">
+            <wp:extent cx="5486400" cy="3130550"/>
+            <wp:effectExtent l="0" t="0" r="0" b="0"/>
+            <wp:docPr id="672748835" name="Picture 1"/>
+            <wp:cNvGraphicFramePr>
+              <a:graphicFrameLocks xmlns:a="http://schemas.openxmlformats.org/drawingml/2006/main" noChangeAspect="1"/>
+            </wp:cNvGraphicFramePr>
+            <a:graphic xmlns:a="http://schemas.openxmlformats.org/drawingml/2006/main">
+              <a:graphicData uri="http://schemas.openxmlformats.org/drawingml/2006/picture">
+                <pic:pic xmlns:pic="http://schemas.openxmlformats.org/drawingml/2006/picture">
+                  <pic:nvPicPr>
+                    <pic:cNvPr id="672748835" name=""/>
+                    <pic:cNvPicPr/>
+                  </pic:nvPicPr>
+                  <pic:blipFill>
+                    <a:blip r:embed="rId6"/>
+                    <a:stretch>
+                      <a:fillRect/>
+                    </a:stretch>
+                  </pic:blipFill>
+                  <pic:spPr>
+                    <a:xfrm>
+                      <a:off x="0" y="0"/>
+                      <a:ext cx="5486400" cy="3130550"/>
+                    </a:xfrm>
+                    <a:prstGeom prst="rect">
+                      <a:avLst/>
+                    </a:prstGeom>
+                  </pic:spPr>
+                </pic:pic>
+              </a:graphicData>
+            </a:graphic>
+          </wp:inline>
+        </w:drawing>
+      </w:r>
+    </w:p>
+    <w:p>
+      <w:pPr>
+        <w:rPr>
+          <w:rFonts w:ascii="Consolas" w:hAnsi="Consolas"/>
+          <w:sz w:val="18"/>
+        </w:rPr>
+      </w:pPr>
+    </w:p>
+    <w:p/>
+    <w:p>
+      <w:pPr>
+        <w:pStyle w:val="Heading2"/>
+      </w:pPr>
+      <w:r>
+        <w:t>Technology Stack</w:t>
+      </w:r>
+    </w:p>
+    <w:p>
+      <w:pPr>
+        <w:pStyle w:val="ListBullet"/>
+      </w:pPr>
+      <w:r>
+        <w:t>TypeScript (strict mode, ES2022)</w:t>
+      </w:r>
+    </w:p>
+    <w:p>
+      <w:pPr>
+        <w:pStyle w:val="ListBullet"/>
+      </w:pPr>
+      <w:r>
+        <w:t>Playwright (Microsoft browser automation)</w:t>
+      </w:r>
+    </w:p>
+    <w:p>
+      <w:pPr>
+        <w:pStyle w:val="ListBullet"/>
+      </w:pPr>
+      <w:r>
+        <w:t>5 AI Providers (OpenAI, Azure OpenAI, Gemini, Claude, Custom)</w:t>
+      </w:r>
+    </w:p>
+    <w:p>
+      <w:pPr>
+        <w:pStyle w:val="ListBullet"/>
+      </w:pPr>
+      <w:r>
+        <w:t>Node.js runtime</w:t>
+      </w:r>
+    </w:p>
+    <w:p>
+      <w:pPr>
+        <w:pStyle w:val="ListBullet"/>
+      </w:pPr>
+      <w:r>
+        <w:t>Open source — $0 licensing</w:t>
+      </w:r>
+    </w:p>
+    <w:p>
+      <w:r>
+        <w:br w:type="page"/>
+      </w:r>
+    </w:p>
+    <w:p>
+      <w:pPr>
+        <w:pStyle w:val="Heading1"/>
+      </w:pPr>
+      <w:r>
+        <w:lastRenderedPageBreak/>
+        <w:t>Key Features</w:t>
+      </w:r>
+    </w:p>
+    <w:p>
+      <w:pPr>
+        <w:pStyle w:val="Heading2"/>
+      </w:pPr>
+      <w:r>
+        <w:t>1. Multi-Agent Orchestration</w:t>
+      </w:r>
+    </w:p>
+    <w:p>
+      <w:r>
+        <w:t>A supervisor agent coordinates specialist agents. Run all tests with one command, or target a single agent. Agents are autonomous — they execute, report metrics, and can be extended with new capabilities.</w:t>
+      </w:r>
+    </w:p>
+    <w:p>
+      <w:pPr>
+        <w:pStyle w:val="Heading2"/>
+      </w:pPr>
+      <w:r>
+        <w:t>2. Self-Healing Selectors</w:t>
+      </w:r>
+    </w:p>
+    <w:p>
+      <w:r>
+        <w:t>When a selector breaks (developer renamed a button), the framework tries 4 strategies: attribute fallback, text content, structural similarity, and AI-assisted healing. Tests keep running without human intervention.</w:t>
+      </w:r>
+    </w:p>
+    <w:p>
+      <w:pPr>
+        <w:pStyle w:val="Heading2"/>
+      </w:pPr>
+      <w:r>
+        <w:t>3. Pluggable AI Providers</w:t>
+      </w:r>
+    </w:p>
+    <w:p>
+      <w:r>
+        <w:t>Switch between OpenAI, Azure OpenAI, Google Gemini, and Anthropic Claude with one config change. AI generates tests from descriptions, diagnoses failures, and suggests fixes. No vendor lock-in.</w:t>
+      </w:r>
+    </w:p>
+    <w:p>
+      <w:pPr>
+        <w:pStyle w:val="Heading2"/>
+      </w:pPr>
+      <w:r>
+        <w:t>4. Page Object Model (POM)</w:t>
+      </w:r>
+    </w:p>
+    <w:p>
+      <w:r>
+        <w:t>BasePage class provides self-healing, visual regression, and element discovery. Locators defined once, reused across all tests. Change one file, not 100 tests.</w:t>
+      </w:r>
+    </w:p>
+    <w:p>
+      <w:pPr>
+        <w:pStyle w:val="Heading2"/>
+      </w:pPr>
+      <w:r>
+        <w:t>5. Visual Regression Testing</w:t>
+      </w:r>
+    </w:p>
+    <w:p>
+      <w:r>
+        <w:t>Pixel-level screenshot comparison with configurable thresholds. Auto-baseline management and the ability to mask dynamic regions.</w:t>
+      </w:r>
+    </w:p>
+    <w:p>
+      <w:r>
+        <w:br w:type="page"/>
+      </w:r>
+    </w:p>
+    <w:p>
+      <w:pPr>
+        <w:pStyle w:val="Heading1"/>
+      </w:pPr>
+      <w:r>
+        <w:lastRenderedPageBreak/>
+        <w:t>Live Demo</w:t>
+      </w:r>
+    </w:p>
+    <w:p>
+      <w:pPr>
+        <w:pStyle w:val="Heading2"/>
+      </w:pPr>
+      <w:r>
+        <w:t>Run All Agents</w:t>
+      </w:r>
+    </w:p>
+    <w:p>
+      <w:r>
+        <w:t>Command: npx tsx examples/agent-demo.ts</w:t>
+      </w:r>
+    </w:p>
+    <w:p/>
+    <w:p>
+      <w:r>
+        <w:t>Expected output:</w:t>
+      </w:r>
+    </w:p>
+    <w:p>
+      <w:pPr>
+        <w:pStyle w:val="ListBullet"/>
+      </w:pPr>
+      <w:r>
+        <w:t xml:space="preserve">  WebAgent:    ✅ PASSED (5/5 passed in 9.3s)</w:t>
+      </w:r>
+    </w:p>
+    <w:p>
+      <w:pPr>
+        <w:pStyle w:val="ListBullet"/>
+      </w:pPr>
+      <w:r>
+        <w:t xml:space="preserve">  ApiAgent:    ✅ PASSED (5/5 passed in 8.2s)</w:t>
+      </w:r>
+    </w:p>
+    <w:p>
+      <w:pPr>
+        <w:pStyle w:val="ListBullet"/>
+      </w:pPr>
+      <w:r>
+        <w:t xml:space="preserve">  MobileAgent: ✅ PASSED (3/3 passed in 7.1s)</w:t>
+      </w:r>
+    </w:p>
+    <w:p>
+      <w:pPr>
+        <w:pStyle w:val="ListBullet"/>
+      </w:pPr>
+      <w:r>
+        <w:t xml:space="preserve">  SapAgent:    ⚠️  Not configured (no SAP env)</w:t>
+      </w:r>
+    </w:p>
+    <w:p>
+      <w:pPr>
+        <w:pStyle w:val="ListBullet"/>
+      </w:pPr>
+      <w:r>
+        <w:t xml:space="preserve">  Total: 13 tests, 100% pass rate, ~24.5s</w:t>
+      </w:r>
+    </w:p>
+    <w:p>
+      <w:pPr>
+        <w:pStyle w:val="Heading2"/>
+      </w:pPr>
+      <w:r>
+        <w:t>Run Single Agent</w:t>
+      </w:r>
+    </w:p>
+    <w:tbl>
+      <w:tblPr>
+        <w:tblStyle w:val="LightGrid-Accent1"/>
+        <w:tblW w:w="0" w:type="auto"/>
+        <w:tblLook w:val="04A0" w:firstRow="1" w:lastRow="0" w:firstColumn="1" w:lastColumn="0" w:noHBand="0" w:noVBand="1"/>
+      </w:tblPr>
+      <w:tblGrid>
+        <w:gridCol w:w="4320"/>
+        <w:gridCol w:w="4320"/>
+      </w:tblGrid>
+      <w:tr>
+        <w:trPr>
+          <w:cnfStyle w:val="100000000000" w:firstRow="1" w:lastRow="0" w:firstColumn="0" w:lastColumn="0" w:oddVBand="0" w:evenVBand="0" w:oddHBand="0" w:evenHBand="0" w:firstRowFirstColumn="0" w:firstRowLastColumn="0" w:lastRowFirstColumn="0" w:lastRowLastColumn="0"/>
+        </w:trPr>
+        <w:tc>
+          <w:tcPr>
+            <w:cnfStyle w:val="001000000000" w:firstRow="0" w:lastRow="0" w:firstColumn="1" w:lastColumn="0" w:oddVBand="0" w:evenVBand="0" w:oddHBand="0" w:evenHBand="0" w:firstRowFirstColumn="0" w:firstRowLastColumn="0" w:lastRowFirstColumn="0" w:lastRowLastColumn="0"/>
+            <w:tcW w:w="4320" w:type="dxa"/>
+          </w:tcPr>
+          <w:p>
+            <w:r>
+              <w:t>Command</w:t>
+            </w:r>
+          </w:p>
+        </w:tc>
+        <w:tc>
+          <w:tcPr>
+            <w:tcW w:w="4320" w:type="dxa"/>
+          </w:tcPr>
+          <w:p>
+            <w:pPr>
+              <w:cnfStyle w:val="100000000000" w:firstRow="1" w:lastRow="0" w:firstColumn="0" w:lastColumn="0" w:oddVBand="0" w:evenVBand="0" w:oddHBand="0" w:evenHBand="0" w:firstRowFirstColumn="0" w:firstRowLastColumn="0" w:lastRowFirstColumn="0" w:lastRowLastColumn="0"/>
+            </w:pPr>
+            <w:r>
+              <w:t>What It Runs</w:t>
+            </w:r>
+          </w:p>
+        </w:tc>
+      </w:tr>
+      <w:tr>
+        <w:trPr>
+          <w:cnfStyle w:val="000000100000" w:firstRow="0" w:lastRow="0" w:firstColumn="0" w:lastColumn="0" w:oddVBand="0" w:evenVBand="0" w:oddHBand="1" w:evenHBand="0" w:firstRowFirstColumn="0" w:firstRowLastColumn="0" w:lastRowFirstColumn="0" w:lastRowLastColumn="0"/>
+        </w:trPr>
+        <w:tc>
+          <w:tcPr>
+            <w:cnfStyle w:val="001000000000" w:firstRow="0" w:lastRow="0" w:firstColumn="1" w:lastColumn="0" w:oddVBand="0" w:evenVBand="0" w:oddHBand="0" w:evenHBand="0" w:firstRowFirstColumn="0" w:firstRowLastColumn="0" w:lastRowFirstColumn="0" w:lastRowLastColumn="0"/>
+            <w:tcW w:w="4320" w:type="dxa"/>
+          </w:tcPr>
+          <w:p>
+            <w:r>
+              <w:t>npx tsx examples/agent-demo.ts web</w:t>
+            </w:r>
+          </w:p>
+        </w:tc>
+        <w:tc>
+          <w:tcPr>
+            <w:tcW w:w="4320" w:type="dxa"/>
+          </w:tcPr>
+          <w:p>
+            <w:pPr>
+              <w:cnfStyle w:val="000000100000" w:firstRow="0" w:lastRow="0" w:firstColumn="0" w:lastColumn="0" w:oddVBand="0" w:evenVBand="0" w:oddHBand="1" w:evenHBand="0" w:firstRowFirstColumn="0" w:firstRowLastColumn="0" w:lastRowFirstColumn="0" w:lastRowLastColumn="0"/>
+            </w:pPr>
+            <w:r>
+              <w:t>SauceDemo e-commerce tests (5 tests)</w:t>
+            </w:r>
+          </w:p>
+        </w:tc>
+      </w:tr>
+      <w:tr>
+        <w:trPr>
+          <w:cnfStyle w:val="000000010000" w:firstRow="0" w:lastRow="0" w:firstColumn="0" w:lastColumn="0" w:oddVBand="0" w:evenVBand="0" w:oddHBand="0" w:evenHBand="1" w:firstRowFirstColumn="0" w:firstRowLastColumn="0" w:lastRowFirstColumn="0" w:lastRowLastColumn="0"/>
+        </w:trPr>
+        <w:tc>
+          <w:tcPr>
+            <w:cnfStyle w:val="001000000000" w:firstRow="0" w:lastRow="0" w:firstColumn="1" w:lastColumn="0" w:oddVBand="0" w:evenVBand="0" w:oddHBand="0" w:evenHBand="0" w:firstRowFirstColumn="0" w:firstRowLastColumn="0" w:lastRowFirstColumn="0" w:lastRowLastColumn="0"/>
+            <w:tcW w:w="4320" w:type="dxa"/>
+          </w:tcPr>
+          <w:p>
+            <w:r>
+              <w:t>npx tsx examples/agent-demo.ts api</w:t>
+            </w:r>
+          </w:p>
+        </w:tc>
+        <w:tc>
+          <w:tcPr>
+            <w:tcW w:w="4320" w:type="dxa"/>
+          </w:tcPr>
+          <w:p>
+            <w:pPr>
+              <w:cnfStyle w:val="000000010000" w:firstRow="0" w:lastRow="0" w:firstColumn="0" w:lastColumn="0" w:oddVBand="0" w:evenVBand="0" w:oddHBand="0" w:evenHBand="1" w:firstRowFirstColumn="0" w:firstRowLastColumn="0" w:lastRowFirstColumn="0" w:lastRowLastColumn="0"/>
+            </w:pPr>
+            <w:r>
+              <w:t>REST API CRUD tests (5 tests)</w:t>
+            </w:r>
+          </w:p>
+        </w:tc>
+      </w:tr>
+      <w:tr>
+        <w:trPr>
+          <w:cnfStyle w:val="000000100000" w:firstRow="0" w:lastRow="0" w:firstColumn="0" w:lastColumn="0" w:oddVBand="0" w:evenVBand="0" w:oddHBand="1" w:evenHBand="0" w:firstRowFirstColumn="0" w:firstRowLastColumn="0" w:lastRowFirstColumn="0" w:lastRowLastColumn="0"/>
+        </w:trPr>
+        <w:tc>
+          <w:tcPr>
+            <w:cnfStyle w:val="001000000000" w:firstRow="0" w:lastRow="0" w:firstColumn="1" w:lastColumn="0" w:oddVBand="0" w:evenVBand="0" w:oddHBand="0" w:evenHBand="0" w:firstRowFirstColumn="0" w:firstRowLastColumn="0" w:lastRowFirstColumn="0" w:lastRowLastColumn="0"/>
+            <w:tcW w:w="4320" w:type="dxa"/>
+          </w:tcPr>
+          <w:p>
+            <w:r>
+              <w:t>npx tsx examples/agent-demo.ts mobile</w:t>
+            </w:r>
+          </w:p>
+        </w:tc>
+        <w:tc>
+          <w:tcPr>
+            <w:tcW w:w="4320" w:type="dxa"/>
+          </w:tcPr>
+          <w:p>
+            <w:pPr>
+              <w:cnfStyle w:val="000000100000" w:firstRow="0" w:lastRow="0" w:firstColumn="0" w:lastColumn="0" w:oddVBand="0" w:evenVBand="0" w:oddHBand="1" w:evenHBand="0" w:firstRowFirstColumn="0" w:firstRowLastColumn="0" w:lastRowFirstColumn="0" w:lastRowLastColumn="0"/>
+            </w:pPr>
+            <w:r>
+              <w:t>Device viewport tests (3 tests)</w:t>
+            </w:r>
+          </w:p>
+        </w:tc>
+      </w:tr>
+      <w:tr>
+        <w:trPr>
+          <w:cnfStyle w:val="000000010000" w:firstRow="0" w:lastRow="0" w:firstColumn="0" w:lastColumn="0" w:oddVBand="0" w:evenVBand="0" w:oddHBand="0" w:evenHBand="1" w:firstRowFirstColumn="0" w:firstRowLastColumn="0" w:lastRowFirstColumn="0" w:lastRowLastColumn="0"/>
+        </w:trPr>
+        <w:tc>
+          <w:tcPr>
+            <w:cnfStyle w:val="001000000000" w:firstRow="0" w:lastRow="0" w:firstColumn="1" w:lastColumn="0" w:oddVBand="0" w:evenVBand="0" w:oddHBand="0" w:evenHBand="0" w:firstRowFirstColumn="0" w:firstRowLastColumn="0" w:lastRowFirstColumn="0" w:lastRowLastColumn="0"/>
+            <w:tcW w:w="4320" w:type="dxa"/>
+          </w:tcPr>
+          <w:p>
+            <w:r>
+              <w:t>npx tsx examples/agent-demo.ts sap</w:t>
+            </w:r>
+          </w:p>
+        </w:tc>
+        <w:tc>
+          <w:tcPr>
+            <w:tcW w:w="4320" w:type="dxa"/>
+          </w:tcPr>
+          <w:p>
+            <w:pPr>
+              <w:cnfStyle w:val="000000010000" w:firstRow="0" w:lastRow="0" w:firstColumn="0" w:lastColumn="0" w:oddVBand="0" w:evenVBand="0" w:oddHBand="0" w:evenHBand="1" w:firstRowFirstColumn="0" w:firstRowLastColumn="0" w:lastRowFirstColumn="0" w:lastRowLastColumn="0"/>
+            </w:pPr>
+            <w:r>
+              <w:t>SAP connectivity check</w:t>
+            </w:r>
+          </w:p>
+        </w:tc>
+      </w:tr>
+    </w:tbl>
+    <w:p>
+      <w:pPr>
+        <w:pStyle w:val="Heading2"/>
+      </w:pPr>
+      <w:r>
+        <w:t>Run Tests Directly (no agent layer)</w:t>
+      </w:r>
+    </w:p>
+    <w:p>
+      <w:pPr>
+        <w:pStyle w:val="ListBullet"/>
+      </w:pPr>
+      <w:r>
+        <w:t>npx playwright test examples/saucedemo-test.spec.ts</w:t>
       </w:r>
     </w:p>
     <w:p>
@@ -778,7 +1112,7 @@
       </w:pPr>
       <w:r>
         <w:lastRenderedPageBreak/>
-        <w:t>Numbers to Remember</w:t>
+        <w:t>Results at a Glance</w:t>
       </w:r>
     </w:p>
     <w:tbl>
@@ -831,7 +1165,7 @@
           </w:tcPr>
           <w:p>
             <w:r>
-              <w:t>Total Tests</w:t>
+              <w:t>Total Tests Passing</w:t>
             </w:r>
           </w:p>
         </w:tc>
@@ -844,7 +1178,7 @@
               <w:cnfStyle w:val="000000100000" w:firstRow="0" w:lastRow="0" w:firstColumn="0" w:lastColumn="0" w:oddVBand="0" w:evenVBand="0" w:oddHBand="1" w:evenHBand="0" w:firstRowFirstColumn="0" w:firstRowLastColumn="0" w:lastRowFirstColumn="0" w:lastRowLastColumn="0"/>
             </w:pPr>
             <w:r>
-              <w:t>22 across 5 platforms</w:t>
+              <w:t>13 (Web 5, API 5, Mobile 3)</w:t>
             </w:r>
           </w:p>
         </w:tc>
@@ -860,7 +1194,7 @@
           </w:tcPr>
           <w:p>
             <w:r>
-              <w:t>Execution Time</w:t>
+              <w:t>Specialist Agents</w:t>
             </w:r>
           </w:p>
         </w:tc>
@@ -873,7 +1207,7 @@
               <w:cnfStyle w:val="000000010000" w:firstRow="0" w:lastRow="0" w:firstColumn="0" w:lastColumn="0" w:oddVBand="0" w:evenVBand="0" w:oddHBand="0" w:evenHBand="1" w:firstRowFirstColumn="0" w:firstRowLastColumn="0" w:lastRowFirstColumn="0" w:lastRowLastColumn="0"/>
             </w:pPr>
             <w:r>
-              <w:t>Under 30 seconds</w:t>
+              <w:t>4 (Web, API, Mobile, SAP)</w:t>
             </w:r>
           </w:p>
         </w:tc>
@@ -889,7 +1223,7 @@
           </w:tcPr>
           <w:p>
             <w:r>
-              <w:t>AI Providers</w:t>
+              <w:t>Pass Rate</w:t>
             </w:r>
           </w:p>
         </w:tc>
@@ -902,7 +1236,7 @@
               <w:cnfStyle w:val="000000100000" w:firstRow="0" w:lastRow="0" w:firstColumn="0" w:lastColumn="0" w:oddVBand="0" w:evenVBand="0" w:oddHBand="1" w:evenHBand="0" w:firstRowFirstColumn="0" w:firstRowLastColumn="0" w:lastRowFirstColumn="0" w:lastRowLastColumn="0"/>
             </w:pPr>
             <w:r>
-              <w:t>5 supported</w:t>
+              <w:t>100%</w:t>
             </w:r>
           </w:p>
         </w:tc>
@@ -918,7 +1252,7 @@
           </w:tcPr>
           <w:p>
             <w:r>
-              <w:t>Self-Healing Strategies</w:t>
+              <w:t>Total Runtime</w:t>
             </w:r>
           </w:p>
         </w:tc>
@@ -931,7 +1265,7 @@
               <w:cnfStyle w:val="000000010000" w:firstRow="0" w:lastRow="0" w:firstColumn="0" w:lastColumn="0" w:oddVBand="0" w:evenVBand="0" w:oddHBand="0" w:evenHBand="1" w:firstRowFirstColumn="0" w:firstRowLastColumn="0" w:lastRowFirstColumn="0" w:lastRowLastColumn="0"/>
             </w:pPr>
             <w:r>
-              <w:t>4 fallback strategies</w:t>
+              <w:t>~24.5 seconds</w:t>
             </w:r>
           </w:p>
         </w:tc>
@@ -939,6 +1273,35 @@
       <w:tr>
         <w:trPr>
           <w:cnfStyle w:val="000000100000" w:firstRow="0" w:lastRow="0" w:firstColumn="0" w:lastColumn="0" w:oddVBand="0" w:evenVBand="0" w:oddHBand="1" w:evenHBand="0" w:firstRowFirstColumn="0" w:firstRowLastColumn="0" w:lastRowFirstColumn="0" w:lastRowLastColumn="0"/>
+        </w:trPr>
+        <w:tc>
+          <w:tcPr>
+            <w:cnfStyle w:val="001000000000" w:firstRow="0" w:lastRow="0" w:firstColumn="1" w:lastColumn="0" w:oddVBand="0" w:evenVBand="0" w:oddHBand="0" w:evenHBand="0" w:firstRowFirstColumn="0" w:firstRowLastColumn="0" w:lastRowFirstColumn="0" w:lastRowLastColumn="0"/>
+            <w:tcW w:w="4320" w:type="dxa"/>
+          </w:tcPr>
+          <w:p>
+            <w:r>
+              <w:t>AI Providers Supported</w:t>
+            </w:r>
+          </w:p>
+        </w:tc>
+        <w:tc>
+          <w:tcPr>
+            <w:tcW w:w="4320" w:type="dxa"/>
+          </w:tcPr>
+          <w:p>
+            <w:pPr>
+              <w:cnfStyle w:val="000000100000" w:firstRow="0" w:lastRow="0" w:firstColumn="0" w:lastColumn="0" w:oddVBand="0" w:evenVBand="0" w:oddHBand="1" w:evenHBand="0" w:firstRowFirstColumn="0" w:firstRowLastColumn="0" w:lastRowFirstColumn="0" w:lastRowLastColumn="0"/>
+            </w:pPr>
+            <w:r>
+              <w:t>5</w:t>
+            </w:r>
+          </w:p>
+        </w:tc>
+      </w:tr>
+      <w:tr>
+        <w:trPr>
+          <w:cnfStyle w:val="000000010000" w:firstRow="0" w:lastRow="0" w:firstColumn="0" w:lastColumn="0" w:oddVBand="0" w:evenVBand="0" w:oddHBand="0" w:evenHBand="1" w:firstRowFirstColumn="0" w:firstRowLastColumn="0" w:lastRowFirstColumn="0" w:lastRowLastColumn="0"/>
         </w:trPr>
         <w:tc>
           <w:tcPr>
@@ -957,7 +1320,7 @@
           </w:tcPr>
           <w:p>
             <w:pPr>
-              <w:cnfStyle w:val="000000100000" w:firstRow="0" w:lastRow="0" w:firstColumn="0" w:lastColumn="0" w:oddVBand="0" w:evenVBand="0" w:oddHBand="1" w:evenHBand="0" w:firstRowFirstColumn="0" w:firstRowLastColumn="0" w:lastRowFirstColumn="0" w:lastRowLastColumn="0"/>
+              <w:cnfStyle w:val="000000010000" w:firstRow="0" w:lastRow="0" w:firstColumn="0" w:lastColumn="0" w:oddVBand="0" w:evenVBand="0" w:oddHBand="0" w:evenHBand="1" w:firstRowFirstColumn="0" w:firstRowLastColumn="0" w:lastRowFirstColumn="0" w:lastRowLastColumn="0"/>
             </w:pPr>
             <w:r>
               <w:t>$0 (open source)</w:t>
@@ -985,7 +1348,7 @@
         <w:pStyle w:val="ListBullet"/>
       </w:pPr>
       <w:r>
-        <w:t>Reduce tool licensing costs — replaces 3-5 separate tools with one open-source framework</w:t>
+        <w:t>Eliminate tool sprawl — replaces 3-5 separate tools with one framework</w:t>
       </w:r>
     </w:p>
     <w:p>
@@ -1001,7 +1364,7 @@
         <w:pStyle w:val="ListBullet"/>
       </w:pPr>
       <w:r>
-        <w:t>5x faster test creation — AI generates tests from descriptions</w:t>
+        <w:t>5x faster test creation — AI generates tests from natural language</w:t>
       </w:r>
     </w:p>
     <w:p>
@@ -1009,7 +1372,15 @@
         <w:pStyle w:val="ListBullet"/>
       </w:pPr>
       <w:r>
-        <w:t>One skill set — TypeScript + Playwright covers all platforms</w:t>
+        <w:t>One skill set — TypeScript covers all platforms, no team silos</w:t>
+      </w:r>
+    </w:p>
+    <w:p>
+      <w:pPr>
+        <w:pStyle w:val="ListBullet"/>
+      </w:pPr>
+      <w:r>
+        <w:t>Autonomous operation — agents run, diagnose, and report without intervention</w:t>
       </w:r>
     </w:p>
     <w:p>
@@ -1026,6 +1397,15 @@
       </w:pPr>
       <w:r>
         <w:t>Enterprise-ready — SAP Fiori, REST APIs, responsive mobile, visual regression</w:t>
+      </w:r>
+    </w:p>
+    <w:p/>
+    <w:p>
+      <w:r>
+        <w:rPr>
+          <w:b/>
+        </w:rPr>
+        <w:t>Bottom line: Faster releases, fewer flaky tests, lower licensing costs, one team can test everything.</w:t>
       </w:r>
     </w:p>
     <w:p>
@@ -1039,7 +1419,101 @@
       </w:pPr>
       <w:r>
         <w:lastRenderedPageBreak/>
-        <w:t>Anticipated Questions &amp; Answers</w:t>
+        <w:t>Roadmap</w:t>
+      </w:r>
+    </w:p>
+    <w:p>
+      <w:pPr>
+        <w:pStyle w:val="Heading2"/>
+      </w:pPr>
+      <w:r>
+        <w:t>Completed</w:t>
+      </w:r>
+    </w:p>
+    <w:p>
+      <w:pPr>
+        <w:pStyle w:val="ListBullet"/>
+      </w:pPr>
+      <w:r>
+        <w:t>Phase 1: Core foundation — BaseAgent, MessageBus, AgentRegistry, Types</w:t>
+      </w:r>
+    </w:p>
+    <w:p>
+      <w:pPr>
+        <w:pStyle w:val="ListBullet"/>
+      </w:pPr>
+      <w:r>
+        <w:t>Phase 2: Supervisor + WebAgent — orchestration + browser testing</w:t>
+      </w:r>
+    </w:p>
+    <w:p>
+      <w:pPr>
+        <w:pStyle w:val="ListBullet"/>
+      </w:pPr>
+      <w:r>
+        <w:t>Phase 3: API Agent, Mobile Agent, SAP Agent — full specialist coverage</w:t>
+      </w:r>
+    </w:p>
+    <w:p>
+      <w:pPr>
+        <w:pStyle w:val="Heading2"/>
+      </w:pPr>
+      <w:r>
+        <w:t>Coming Next</w:t>
+      </w:r>
+    </w:p>
+    <w:p>
+      <w:pPr>
+        <w:pStyle w:val="ListBullet"/>
+      </w:pPr>
+      <w:r>
+        <w:t>Phase 4: Planner Agent — AI-powered test planning from requirements</w:t>
+      </w:r>
+    </w:p>
+    <w:p>
+      <w:pPr>
+        <w:pStyle w:val="ListBullet"/>
+      </w:pPr>
+      <w:r>
+        <w:t>Phase 4: Healer Agent — auto-diagnose and fix failing tests</w:t>
+      </w:r>
+    </w:p>
+    <w:p>
+      <w:pPr>
+        <w:pStyle w:val="ListBullet"/>
+      </w:pPr>
+      <w:r>
+        <w:t>Phase 5: Report Agent — AI-generated analytics and recommendations</w:t>
+      </w:r>
+    </w:p>
+    <w:p>
+      <w:pPr>
+        <w:pStyle w:val="ListBullet"/>
+      </w:pPr>
+      <w:r>
+        <w:t>CI/CD integration — GitHub Actions, Azure DevOps</w:t>
+      </w:r>
+    </w:p>
+    <w:p>
+      <w:pPr>
+        <w:pStyle w:val="ListBullet"/>
+      </w:pPr>
+      <w:r>
+        <w:t>SAP system pilot — connect to real SAP environment</w:t>
+      </w:r>
+    </w:p>
+    <w:p>
+      <w:r>
+        <w:br w:type="page"/>
+      </w:r>
+    </w:p>
+    <w:p>
+      <w:pPr>
+        <w:pStyle w:val="Heading1"/>
+      </w:pPr>
+      <w:r>
+        <w:lastRenderedPageBreak/>
+        <w:t>Anticipated Questions</w:t>
       </w:r>
     </w:p>
     <w:tbl>
@@ -1105,7 +1579,7 @@
               <w:cnfStyle w:val="000000100000" w:firstRow="0" w:lastRow="0" w:firstColumn="0" w:lastColumn="0" w:oddVBand="0" w:evenVBand="0" w:oddHBand="1" w:evenHBand="0" w:firstRowFirstColumn="0" w:firstRowLastColumn="0" w:lastRowFirstColumn="0" w:lastRowLastColumn="0"/>
             </w:pPr>
             <w:r>
-              <w:t>Selenium is 20 years old, no AI, no self-healing, no API testing, slower. Playwright (our foundation) is Microsoft's modern replacement.</w:t>
+              <w:t>Selenium is 20 years old, no AI, no self-healing, no agent orchestration. Playwright (our foundation) is Microsoft's modern replacement with multi-browser support.</w:t>
             </w:r>
           </w:p>
         </w:tc>
@@ -1113,6 +1587,35 @@
       <w:tr>
         <w:trPr>
           <w:cnfStyle w:val="000000010000" w:firstRow="0" w:lastRow="0" w:firstColumn="0" w:lastColumn="0" w:oddVBand="0" w:evenVBand="0" w:oddHBand="0" w:evenHBand="1" w:firstRowFirstColumn="0" w:firstRowLastColumn="0" w:lastRowFirstColumn="0" w:lastRowLastColumn="0"/>
+        </w:trPr>
+        <w:tc>
+          <w:tcPr>
+            <w:cnfStyle w:val="001000000000" w:firstRow="0" w:lastRow="0" w:firstColumn="1" w:lastColumn="0" w:oddVBand="0" w:evenVBand="0" w:oddHBand="0" w:evenHBand="0" w:firstRowFirstColumn="0" w:firstRowLastColumn="0" w:lastRowFirstColumn="0" w:lastRowLastColumn="0"/>
+            <w:tcW w:w="4320" w:type="dxa"/>
+          </w:tcPr>
+          <w:p>
+            <w:r>
+              <w:t>What makes the "agentic" approach special?</w:t>
+            </w:r>
+          </w:p>
+        </w:tc>
+        <w:tc>
+          <w:tcPr>
+            <w:tcW w:w="4320" w:type="dxa"/>
+          </w:tcPr>
+          <w:p>
+            <w:pPr>
+              <w:cnfStyle w:val="000000010000" w:firstRow="0" w:lastRow="0" w:firstColumn="0" w:lastColumn="0" w:oddVBand="0" w:evenVBand="0" w:oddHBand="0" w:evenHBand="1" w:firstRowFirstColumn="0" w:firstRowLastColumn="0" w:lastRowFirstColumn="0" w:lastRowLastColumn="0"/>
+            </w:pPr>
+            <w:r>
+              <w:t>Each agent is autonomous and specialized. The supervisor coordinates them like a team lead — you get parallel execution, automatic routing, and a single entry point for all testing.</w:t>
+            </w:r>
+          </w:p>
+        </w:tc>
+      </w:tr>
+      <w:tr>
+        <w:trPr>
+          <w:cnfStyle w:val="000000100000" w:firstRow="0" w:lastRow="0" w:firstColumn="0" w:lastColumn="0" w:oddVBand="0" w:evenVBand="0" w:oddHBand="1" w:evenHBand="0" w:firstRowFirstColumn="0" w:firstRowLastColumn="0" w:lastRowFirstColumn="0" w:lastRowLastColumn="0"/>
         </w:trPr>
         <w:tc>
           <w:tcPr>
@@ -1131,39 +1634,10 @@
           </w:tcPr>
           <w:p>
             <w:pPr>
-              <w:cnfStyle w:val="000000010000" w:firstRow="0" w:lastRow="0" w:firstColumn="0" w:lastColumn="0" w:oddVBand="0" w:evenVBand="0" w:oddHBand="0" w:evenHBand="1" w:firstRowFirstColumn="0" w:firstRowLastColumn="0" w:lastRowFirstColumn="0" w:lastRowLastColumn="0"/>
-            </w:pPr>
-            <w:r>
-              <w:t>Yes, dedicated SAP adapter for Fiori apps.</w:t>
-            </w:r>
-          </w:p>
-        </w:tc>
-      </w:tr>
-      <w:tr>
-        <w:trPr>
-          <w:cnfStyle w:val="000000100000" w:firstRow="0" w:lastRow="0" w:firstColumn="0" w:lastColumn="0" w:oddVBand="0" w:evenVBand="0" w:oddHBand="1" w:evenHBand="0" w:firstRowFirstColumn="0" w:firstRowLastColumn="0" w:lastRowFirstColumn="0" w:lastRowLastColumn="0"/>
-        </w:trPr>
-        <w:tc>
-          <w:tcPr>
-            <w:cnfStyle w:val="001000000000" w:firstRow="0" w:lastRow="0" w:firstColumn="1" w:lastColumn="0" w:oddVBand="0" w:evenVBand="0" w:oddHBand="0" w:evenHBand="0" w:firstRowFirstColumn="0" w:firstRowLastColumn="0" w:lastRowFirstColumn="0" w:lastRowLastColumn="0"/>
-            <w:tcW w:w="4320" w:type="dxa"/>
-          </w:tcPr>
-          <w:p>
-            <w:r>
-              <w:t>Is it production-ready?</w:t>
-            </w:r>
-          </w:p>
-        </w:tc>
-        <w:tc>
-          <w:tcPr>
-            <w:tcW w:w="4320" w:type="dxa"/>
-          </w:tcPr>
-          <w:p>
-            <w:pPr>
               <w:cnfStyle w:val="000000100000" w:firstRow="0" w:lastRow="0" w:firstColumn="0" w:lastColumn="0" w:oddVBand="0" w:evenVBand="0" w:oddHBand="1" w:evenHBand="0" w:firstRowFirstColumn="0" w:firstRowLastColumn="0" w:lastRowFirstColumn="0" w:lastRowLastColumn="0"/>
             </w:pPr>
             <w:r>
-              <w:t>It's a framework — teams can adopt it incrementally. Start with one app, expand.</w:t>
+              <w:t>Yes, there's a dedicated SAP Agent for Fiori/UI5 apps. It uses dhikraft patterns for UI5 elements.</w:t>
             </w:r>
           </w:p>
         </w:tc>
@@ -1192,7 +1666,7 @@
               <w:cnfStyle w:val="000000010000" w:firstRow="0" w:lastRow="0" w:firstColumn="0" w:lastColumn="0" w:oddVBand="0" w:evenVBand="0" w:oddHBand="0" w:evenHBand="1" w:firstRowFirstColumn="0" w:firstRowLastColumn="0" w:lastRowFirstColumn="0" w:lastRowLastColumn="0"/>
             </w:pPr>
             <w:r>
-              <w:t>TypeScript basics. One language covers all platforms.</w:t>
+              <w:t>TypeScript basics. One language covers all platforms — no Java for Selenium, no Python for API, no separate SAP tool.</w:t>
             </w:r>
           </w:p>
         </w:tc>
@@ -1200,35 +1674,6 @@
       <w:tr>
         <w:trPr>
           <w:cnfStyle w:val="000000100000" w:firstRow="0" w:lastRow="0" w:firstColumn="0" w:lastColumn="0" w:oddVBand="0" w:evenVBand="0" w:oddHBand="1" w:evenHBand="0" w:firstRowFirstColumn="0" w:firstRowLastColumn="0" w:lastRowFirstColumn="0" w:lastRowLastColumn="0"/>
-        </w:trPr>
-        <w:tc>
-          <w:tcPr>
-            <w:cnfStyle w:val="001000000000" w:firstRow="0" w:lastRow="0" w:firstColumn="1" w:lastColumn="0" w:oddVBand="0" w:evenVBand="0" w:oddHBand="0" w:evenHBand="0" w:firstRowFirstColumn="0" w:firstRowLastColumn="0" w:lastRowFirstColumn="0" w:lastRowLastColumn="0"/>
-            <w:tcW w:w="4320" w:type="dxa"/>
-          </w:tcPr>
-          <w:p>
-            <w:r>
-              <w:t>What about security/credentials?</w:t>
-            </w:r>
-          </w:p>
-        </w:tc>
-        <w:tc>
-          <w:tcPr>
-            <w:tcW w:w="4320" w:type="dxa"/>
-          </w:tcPr>
-          <w:p>
-            <w:pPr>
-              <w:cnfStyle w:val="000000100000" w:firstRow="0" w:lastRow="0" w:firstColumn="0" w:lastColumn="0" w:oddVBand="0" w:evenVBand="0" w:oddHBand="1" w:evenHBand="0" w:firstRowFirstColumn="0" w:firstRowLastColumn="0" w:lastRowFirstColumn="0" w:lastRowLastColumn="0"/>
-            </w:pPr>
-            <w:r>
-              <w:t>Test credentials stored in environment variables, never in code.</w:t>
-            </w:r>
-          </w:p>
-        </w:tc>
-      </w:tr>
-      <w:tr>
-        <w:trPr>
-          <w:cnfStyle w:val="000000010000" w:firstRow="0" w:lastRow="0" w:firstColumn="0" w:lastColumn="0" w:oddVBand="0" w:evenVBand="0" w:oddHBand="0" w:evenHBand="1" w:firstRowFirstColumn="0" w:firstRowLastColumn="0" w:lastRowFirstColumn="0" w:lastRowLastColumn="0"/>
         </w:trPr>
         <w:tc>
           <w:tcPr>
@@ -1247,10 +1692,39 @@
           </w:tcPr>
           <w:p>
             <w:pPr>
+              <w:cnfStyle w:val="000000100000" w:firstRow="0" w:lastRow="0" w:firstColumn="0" w:lastColumn="0" w:oddVBand="0" w:evenVBand="0" w:oddHBand="1" w:evenHBand="0" w:firstRowFirstColumn="0" w:firstRowLastColumn="0" w:lastRowFirstColumn="0" w:lastRowLastColumn="0"/>
+            </w:pPr>
+            <w:r>
+              <w:t>Yes — GitHub Actions, Azure DevOps, Jenkins — all supported natively by Playwright.</w:t>
+            </w:r>
+          </w:p>
+        </w:tc>
+      </w:tr>
+      <w:tr>
+        <w:trPr>
+          <w:cnfStyle w:val="000000010000" w:firstRow="0" w:lastRow="0" w:firstColumn="0" w:lastColumn="0" w:oddVBand="0" w:evenVBand="0" w:oddHBand="0" w:evenHBand="1" w:firstRowFirstColumn="0" w:firstRowLastColumn="0" w:lastRowFirstColumn="0" w:lastRowLastColumn="0"/>
+        </w:trPr>
+        <w:tc>
+          <w:tcPr>
+            <w:cnfStyle w:val="001000000000" w:firstRow="0" w:lastRow="0" w:firstColumn="1" w:lastColumn="0" w:oddVBand="0" w:evenVBand="0" w:oddHBand="0" w:evenHBand="0" w:firstRowFirstColumn="0" w:firstRowLastColumn="0" w:lastRowFirstColumn="0" w:lastRowLastColumn="0"/>
+            <w:tcW w:w="4320" w:type="dxa"/>
+          </w:tcPr>
+          <w:p>
+            <w:r>
+              <w:t>What about test data security?</w:t>
+            </w:r>
+          </w:p>
+        </w:tc>
+        <w:tc>
+          <w:tcPr>
+            <w:tcW w:w="4320" w:type="dxa"/>
+          </w:tcPr>
+          <w:p>
+            <w:pPr>
               <w:cnfStyle w:val="000000010000" w:firstRow="0" w:lastRow="0" w:firstColumn="0" w:lastColumn="0" w:oddVBand="0" w:evenVBand="0" w:oddHBand="0" w:evenHBand="1" w:firstRowFirstColumn="0" w:firstRowLastColumn="0" w:lastRowFirstColumn="0" w:lastRowLastColumn="0"/>
             </w:pPr>
             <w:r>
-              <w:t>Yes — GitHub Actions, Azure DevOps, Jenkins — all supported natively.</w:t>
+              <w:t>Credentials stored in environment variables, never in code. Data generation creates synthetic data, never uses real PII.</w:t>
             </w:r>
           </w:p>
         </w:tc>
@@ -1267,7 +1741,7 @@
       </w:pPr>
       <w:r>
         <w:lastRenderedPageBreak/>
-        <w:t>Your 30-Second Elevator Pitch</w:t>
+        <w:t>30-Second Elevator Pitch</w:t>
       </w:r>
     </w:p>
     <w:p/>
@@ -1280,7 +1754,7 @@
           <w:i/>
           <w:sz w:val="24"/>
         </w:rPr>
-        <w:t>"Atomiq AI is a single test automation framework that replaces 5 separate tools. It tests websites, APIs, mobile, and SAP — all in TypeScript. When selectors break, it heals itself. When you need a new test, AI writes it. It runs 22 tests in under 30 seconds, costs nothing to license, and my team built it."</w:t>
+        <w:t>"Atomiq AI is an agentic test automation framework. It has AI agents that autonomously test your web apps, APIs, mobile layouts, and SAP systems. A supervisor agent orchestrates everything — run one command and get a full regression across all platforms in under 30 seconds. It self-heals when selectors break, uses AI to generate tests from English descriptions, and costs nothing to license. I built it."</w:t>
       </w:r>
     </w:p>
     <w:p/>
@@ -1480,31 +1954,31 @@
       </w:rPr>
     </w:lvl>
   </w:abstractNum>
-  <w:num w:numId="1" w16cid:durableId="94447200">
+  <w:num w:numId="1" w16cid:durableId="832716297">
     <w:abstractNumId w:val="8"/>
   </w:num>
-  <w:num w:numId="2" w16cid:durableId="1703238168">
+  <w:num w:numId="2" w16cid:durableId="387605689">
     <w:abstractNumId w:val="6"/>
   </w:num>
-  <w:num w:numId="3" w16cid:durableId="1517957622">
+  <w:num w:numId="3" w16cid:durableId="2111391860">
     <w:abstractNumId w:val="5"/>
   </w:num>
-  <w:num w:numId="4" w16cid:durableId="694230308">
+  <w:num w:numId="4" w16cid:durableId="422384263">
     <w:abstractNumId w:val="4"/>
   </w:num>
-  <w:num w:numId="5" w16cid:durableId="628635484">
+  <w:num w:numId="5" w16cid:durableId="1101486117">
     <w:abstractNumId w:val="7"/>
   </w:num>
-  <w:num w:numId="6" w16cid:durableId="1406032909">
+  <w:num w:numId="6" w16cid:durableId="2092773013">
     <w:abstractNumId w:val="3"/>
   </w:num>
-  <w:num w:numId="7" w16cid:durableId="1695037787">
+  <w:num w:numId="7" w16cid:durableId="1437555848">
     <w:abstractNumId w:val="2"/>
   </w:num>
-  <w:num w:numId="8" w16cid:durableId="370031408">
+  <w:num w:numId="8" w16cid:durableId="219482097">
     <w:abstractNumId w:val="1"/>
   </w:num>
-  <w:num w:numId="9" w16cid:durableId="863711381">
+  <w:num w:numId="9" w16cid:durableId="170876280">
     <w:abstractNumId w:val="0"/>
   </w:num>
 </w:numbering>

</xml_diff>